<commit_message>
Data: archivo de tarea de word 2
</commit_message>
<xml_diff>
--- a/data/EjemploTarea.docx
+++ b/data/EjemploTarea.docx
@@ -1,19 +1,37 @@
 
 <file path=word/document.xml><?xml version="1.0" encoding="utf-8"?>
-<w:document xmlns:wpc="http://schemas.microsoft.com/office/word/2010/wordprocessingCanvas" xmlns:cx="http://schemas.microsoft.com/office/drawing/2014/chartex" xmlns:cx1="http://schemas.microsoft.com/office/drawing/2015/9/8/chartex" xmlns:cx2="http://schemas.microsoft.com/office/drawing/2015/10/21/chartex" xmlns:cx3="http://schemas.microsoft.com/office/drawing/2016/5/9/chartex" xmlns:cx4="http://schemas.microsoft.com/office/drawing/2016/5/10/chartex" xmlns:cx5="http://schemas.microsoft.com/office/drawing/2016/5/11/chartex" xmlns:cx6="http://schemas.microsoft.com/office/drawing/2016/5/12/chartex" xmlns:cx7="http://schemas.microsoft.com/office/drawing/2016/5/13/chartex" xmlns:cx8="http://schemas.microsoft.com/office/drawing/2016/5/14/chartex" xmlns:mc="http://schemas.openxmlformats.org/markup-compatibility/2006" xmlns:aink="http://schemas.microsoft.com/office/drawing/2016/ink" xmlns:am3d="http://schemas.microsoft.com/office/drawing/2017/model3d" xmlns:o="urn:schemas-microsoft-com:office:office" xmlns:oel="http://schemas.microsoft.com/office/2019/extlst" xmlns:r="http://schemas.openxmlformats.org/officeDocument/2006/relationships" xmlns:m="http://schemas.openxmlformats.org/officeDocument/2006/math" xmlns:v="urn:schemas-microsoft-com:vml" xmlns:wp14="http://schemas.microsoft.com/office/word/2010/wordprocessingDrawing" xmlns:wp="http://schemas.openxmlformats.org/drawingml/2006/wordprocessingDrawing" xmlns:w10="urn:schemas-microsoft-com:office:word" xmlns:w="http://schemas.openxmlformats.org/wordprocessingml/2006/main" xmlns:w14="http://schemas.microsoft.com/office/word/2010/wordml" xmlns:w15="http://schemas.microsoft.com/office/word/2012/wordml" xmlns:w16cex="http://schemas.microsoft.com/office/word/2018/wordml/cex" xmlns:w16cid="http://schemas.microsoft.com/office/word/2016/wordml/cid" xmlns:w16="http://schemas.microsoft.com/office/word/2018/wordml" xmlns:w16du="http://schemas.microsoft.com/office/word/2023/wordml/word16du" xmlns:w16sdtdh="http://schemas.microsoft.com/office/word/2020/wordml/sdtdatahash" xmlns:w16se="http://schemas.microsoft.com/office/word/2015/wordml/symex" xmlns:wpg="http://schemas.microsoft.com/office/word/2010/wordprocessingGroup" xmlns:wpi="http://schemas.microsoft.com/office/word/2010/wordprocessingInk" xmlns:wne="http://schemas.microsoft.com/office/word/2006/wordml" xmlns:wps="http://schemas.microsoft.com/office/word/2010/wordprocessingShape" mc:Ignorable="w14 w15 w16se w16cid w16 w16cex w16sdtdh w16du wp14">
+<w:document xmlns:wpc="http://schemas.microsoft.com/office/word/2010/wordprocessingCanvas" xmlns:cx="http://schemas.microsoft.com/office/drawing/2014/chartex" xmlns:cx1="http://schemas.microsoft.com/office/drawing/2015/9/8/chartex" xmlns:cx2="http://schemas.microsoft.com/office/drawing/2015/10/21/chartex" xmlns:cx3="http://schemas.microsoft.com/office/drawing/2016/5/9/chartex" xmlns:cx4="http://schemas.microsoft.com/office/drawing/2016/5/10/chartex" xmlns:cx5="http://schemas.microsoft.com/office/drawing/2016/5/11/chartex" xmlns:cx6="http://schemas.microsoft.com/office/drawing/2016/5/12/chartex" xmlns:cx7="http://schemas.microsoft.com/office/drawing/2016/5/13/chartex" xmlns:cx8="http://schemas.microsoft.com/office/drawing/2016/5/14/chartex" xmlns:mc="http://schemas.openxmlformats.org/markup-compatibility/2006" xmlns:aink="http://schemas.microsoft.com/office/drawing/2016/ink" xmlns:am3d="http://schemas.microsoft.com/office/drawing/2017/model3d" xmlns:o="urn:schemas-microsoft-com:office:office" xmlns:oel="http://schemas.microsoft.com/office/2019/extlst" xmlns:r="http://schemas.openxmlformats.org/officeDocument/2006/relationships" xmlns:m="http://schemas.openxmlformats.org/officeDocument/2006/math" xmlns:v="urn:schemas-microsoft-com:vml" xmlns:wp14="http://schemas.microsoft.com/office/word/2010/wordprocessingDrawing" xmlns:wp="http://schemas.openxmlformats.org/drawingml/2006/wordprocessingDrawing" xmlns:w10="urn:schemas-microsoft-com:office:word" xmlns:w="http://schemas.openxmlformats.org/wordprocessingml/2006/main" xmlns:w14="http://schemas.microsoft.com/office/word/2010/wordml" xmlns:w15="http://schemas.microsoft.com/office/word/2012/wordml" xmlns:w16cex="http://schemas.microsoft.com/office/word/2018/wordml/cex" xmlns:w16cid="http://schemas.microsoft.com/office/word/2016/wordml/cid" xmlns:w16="http://schemas.microsoft.com/office/word/2018/wordml" xmlns:w16du="http://schemas.microsoft.com/office/word/2023/wordml/word16du" xmlns:w16sdtdh="http://schemas.microsoft.com/office/word/2020/wordml/sdtdatahash" xmlns:w16sdtfl="http://schemas.microsoft.com/office/word/2024/wordml/sdtformatlock" xmlns:w16se="http://schemas.microsoft.com/office/word/2015/wordml/symex" xmlns:wpg="http://schemas.microsoft.com/office/word/2010/wordprocessingGroup" xmlns:wpi="http://schemas.microsoft.com/office/word/2010/wordprocessingInk" xmlns:wne="http://schemas.microsoft.com/office/word/2006/wordml" xmlns:wps="http://schemas.microsoft.com/office/word/2010/wordprocessingShape" mc:Ignorable="w14 w15 w16se w16cid w16 w16cex w16sdtdh w16sdtfl w16du wp14">
   <w:body>
     <w:p>
       <w:pPr>
         <w:jc w:val="center"/>
-      </w:pPr>
-      <w:r>
+        <w:rPr>
+          <w:b/>
+          <w:bCs/>
+          <w:i/>
+          <w:iCs/>
+        </w:rPr>
+      </w:pPr>
+      <w:r>
+        <w:rPr>
+          <w:b/>
+          <w:bCs/>
+          <w:i/>
+          <w:iCs/>
+        </w:rPr>
         <w:t>Taller práctico. Primeros pasos en Microsoft Word. AA1-EV02</w:t>
       </w:r>
     </w:p>
     <w:sdt>
       <w:sdtPr>
         <w:rPr>
-          <w:lang w:val="es-ES"/>
+          <w:rFonts w:asciiTheme="minorHAnsi" w:eastAsiaTheme="minorHAnsi" w:hAnsiTheme="minorHAnsi" w:cstheme="minorBidi"/>
+          <w:b w:val="0"/>
+          <w:kern w:val="2"/>
+          <w:sz w:val="24"/>
+          <w:szCs w:val="24"/>
+          <w:lang w:val="es-ES" w:eastAsia="en-US"/>
+          <w14:ligatures w14:val="standardContextual"/>
         </w:rPr>
         <w:id w:val="885223561"/>
         <w:docPartObj>
@@ -23,13 +41,7 @@
       </w:sdtPr>
       <w:sdtEndPr>
         <w:rPr>
-          <w:rFonts w:asciiTheme="minorHAnsi" w:eastAsiaTheme="minorHAnsi" w:hAnsiTheme="minorHAnsi" w:cstheme="minorBidi"/>
           <w:bCs/>
-          <w:kern w:val="2"/>
-          <w:sz w:val="24"/>
-          <w:szCs w:val="24"/>
-          <w:lang w:eastAsia="en-US"/>
-          <w14:ligatures w14:val="standardContextual"/>
         </w:rPr>
       </w:sdtEndPr>
       <w:sdtContent>
@@ -87,21 +99,7 @@
                 <w:rStyle w:val="Hipervnculo"/>
                 <w:noProof/>
               </w:rPr>
-              <w:t>Titulo</w:t>
-            </w:r>
-            <w:r>
-              <w:rPr>
-                <w:rStyle w:val="Hipervnculo"/>
-                <w:noProof/>
-              </w:rPr>
-              <w:t xml:space="preserve"> </w:t>
-            </w:r>
-            <w:r>
-              <w:rPr>
-                <w:rStyle w:val="Hipervnculo"/>
-                <w:noProof/>
-              </w:rPr>
-              <w:t>1</w:t>
+              <w:t>Titulo 1</w:t>
             </w:r>
             <w:r>
               <w:rPr>
@@ -273,21 +271,7 @@
                 <w:rStyle w:val="Hipervnculo"/>
                 <w:noProof/>
               </w:rPr>
-              <w:t>Titu</w:t>
-            </w:r>
-            <w:r>
-              <w:rPr>
-                <w:rStyle w:val="Hipervnculo"/>
-                <w:noProof/>
-              </w:rPr>
-              <w:t>l</w:t>
-            </w:r>
-            <w:r>
-              <w:rPr>
-                <w:rStyle w:val="Hipervnculo"/>
-                <w:noProof/>
-              </w:rPr>
-              <w:t>o 3</w:t>
+              <w:t>Titulo 3</w:t>
             </w:r>
             <w:r>
               <w:rPr>
@@ -369,21 +353,7 @@
                 <w:rStyle w:val="Hipervnculo"/>
                 <w:noProof/>
               </w:rPr>
-              <w:t>Su</w:t>
-            </w:r>
-            <w:r>
-              <w:rPr>
-                <w:rStyle w:val="Hipervnculo"/>
-                <w:noProof/>
-              </w:rPr>
-              <w:t>b</w:t>
-            </w:r>
-            <w:r>
-              <w:rPr>
-                <w:rStyle w:val="Hipervnculo"/>
-                <w:noProof/>
-              </w:rPr>
-              <w:t>titulo</w:t>
+              <w:t>Subtitulo</w:t>
             </w:r>
             <w:r>
               <w:rPr>
@@ -473,21 +443,7 @@
             <w:rStyle w:val="Hipervnculo"/>
             <w:noProof/>
           </w:rPr>
-          <w:t>Figura</w:t>
-        </w:r>
-        <w:r>
-          <w:rPr>
-            <w:rStyle w:val="Hipervnculo"/>
-            <w:noProof/>
-          </w:rPr>
-          <w:t xml:space="preserve"> </w:t>
-        </w:r>
-        <w:r>
-          <w:rPr>
-            <w:rStyle w:val="Hipervnculo"/>
-            <w:noProof/>
-          </w:rPr>
-          <w:t xml:space="preserve"> 1 Descripción de cinta de portapapeles Word</w:t>
+          <w:t>Figura  1 Descripción de cinta de portapapeles Word</w:t>
         </w:r>
         <w:r>
           <w:rPr>
@@ -555,21 +511,7 @@
             <w:rStyle w:val="Hipervnculo"/>
             <w:noProof/>
           </w:rPr>
-          <w:t>Figura  2 Descr</w:t>
-        </w:r>
-        <w:r>
-          <w:rPr>
-            <w:rStyle w:val="Hipervnculo"/>
-            <w:noProof/>
-          </w:rPr>
-          <w:t>i</w:t>
-        </w:r>
-        <w:r>
-          <w:rPr>
-            <w:rStyle w:val="Hipervnculo"/>
-            <w:noProof/>
-          </w:rPr>
-          <w:t>pción de otra cinta diferente</w:t>
+          <w:t>Figura  2 Descripción de otra cinta diferente</w:t>
         </w:r>
         <w:r>
           <w:rPr>
@@ -677,6 +619,9 @@
     </w:p>
     <w:p>
       <w:r>
+        <w:rPr>
+          <w:noProof/>
+        </w:rPr>
         <w:drawing>
           <wp:inline distT="0" distB="0" distL="0" distR="0" wp14:anchorId="5BFB6CEC" wp14:editId="578E6E41">
             <wp:extent cx="895475" cy="1028844"/>
@@ -768,6 +713,9 @@
         </w:rPr>
       </w:pPr>
       <w:r>
+        <w:rPr>
+          <w:noProof/>
+        </w:rPr>
         <w:drawing>
           <wp:inline distT="0" distB="0" distL="0" distR="0" wp14:anchorId="358C8445" wp14:editId="6ABB267A">
             <wp:extent cx="895475" cy="1028844"/>
@@ -938,7 +886,7 @@
           <w:noProof/>
           <w:vertAlign w:val="superscript"/>
         </w:rPr>
-        <w:t>sábado, 10 de agosto de 2024</w:t>
+        <w:t>martes, 21 de abril de 2026</w:t>
       </w:r>
       <w:r>
         <w:rPr>
@@ -1680,6 +1628,9 @@
         <w:jc w:val="center"/>
       </w:pPr>
       <w:r>
+        <w:rPr>
+          <w:noProof/>
+        </w:rPr>
         <w:drawing>
           <wp:inline distT="0" distB="0" distL="0" distR="0" wp14:anchorId="5DFEB4BF" wp14:editId="0F68F25C">
             <wp:extent cx="895475" cy="1028844"/>
@@ -1736,6 +1687,9 @@
         <w:jc w:val="center"/>
       </w:pPr>
       <w:r>
+        <w:rPr>
+          <w:noProof/>
+        </w:rPr>
         <w:drawing>
           <wp:inline distT="0" distB="0" distL="0" distR="0" wp14:anchorId="48266746" wp14:editId="0454B695">
             <wp:extent cx="2991267" cy="981212"/>
@@ -1793,6 +1747,9 @@
         <w:jc w:val="center"/>
       </w:pPr>
       <w:r>
+        <w:rPr>
+          <w:noProof/>
+        </w:rPr>
         <w:drawing>
           <wp:inline distT="0" distB="0" distL="0" distR="0" wp14:anchorId="40ED36EA" wp14:editId="67607F1B">
             <wp:extent cx="2419688" cy="962159"/>
@@ -1862,7 +1819,7 @@
 </file>
 
 <file path=word/numbering.xml><?xml version="1.0" encoding="utf-8"?>
-<w:numbering xmlns:wpc="http://schemas.microsoft.com/office/word/2010/wordprocessingCanvas" xmlns:cx="http://schemas.microsoft.com/office/drawing/2014/chartex" xmlns:cx1="http://schemas.microsoft.com/office/drawing/2015/9/8/chartex" xmlns:cx2="http://schemas.microsoft.com/office/drawing/2015/10/21/chartex" xmlns:cx3="http://schemas.microsoft.com/office/drawing/2016/5/9/chartex" xmlns:cx4="http://schemas.microsoft.com/office/drawing/2016/5/10/chartex" xmlns:cx5="http://schemas.microsoft.com/office/drawing/2016/5/11/chartex" xmlns:cx6="http://schemas.microsoft.com/office/drawing/2016/5/12/chartex" xmlns:cx7="http://schemas.microsoft.com/office/drawing/2016/5/13/chartex" xmlns:cx8="http://schemas.microsoft.com/office/drawing/2016/5/14/chartex" xmlns:mc="http://schemas.openxmlformats.org/markup-compatibility/2006" xmlns:aink="http://schemas.microsoft.com/office/drawing/2016/ink" xmlns:am3d="http://schemas.microsoft.com/office/drawing/2017/model3d" xmlns:o="urn:schemas-microsoft-com:office:office" xmlns:oel="http://schemas.microsoft.com/office/2019/extlst" xmlns:r="http://schemas.openxmlformats.org/officeDocument/2006/relationships" xmlns:m="http://schemas.openxmlformats.org/officeDocument/2006/math" xmlns:v="urn:schemas-microsoft-com:vml" xmlns:wp14="http://schemas.microsoft.com/office/word/2010/wordprocessingDrawing" xmlns:wp="http://schemas.openxmlformats.org/drawingml/2006/wordprocessingDrawing" xmlns:w10="urn:schemas-microsoft-com:office:word" xmlns:w="http://schemas.openxmlformats.org/wordprocessingml/2006/main" xmlns:w14="http://schemas.microsoft.com/office/word/2010/wordml" xmlns:w15="http://schemas.microsoft.com/office/word/2012/wordml" xmlns:w16cex="http://schemas.microsoft.com/office/word/2018/wordml/cex" xmlns:w16cid="http://schemas.microsoft.com/office/word/2016/wordml/cid" xmlns:w16="http://schemas.microsoft.com/office/word/2018/wordml" xmlns:w16du="http://schemas.microsoft.com/office/word/2023/wordml/word16du" xmlns:w16sdtdh="http://schemas.microsoft.com/office/word/2020/wordml/sdtdatahash" xmlns:w16se="http://schemas.microsoft.com/office/word/2015/wordml/symex" xmlns:wpg="http://schemas.microsoft.com/office/word/2010/wordprocessingGroup" xmlns:wpi="http://schemas.microsoft.com/office/word/2010/wordprocessingInk" xmlns:wne="http://schemas.microsoft.com/office/word/2006/wordml" xmlns:wps="http://schemas.microsoft.com/office/word/2010/wordprocessingShape" mc:Ignorable="w14 w15 w16se w16cid w16 w16cex w16sdtdh w16du wp14">
+<w:numbering xmlns:wpc="http://schemas.microsoft.com/office/word/2010/wordprocessingCanvas" xmlns:cx="http://schemas.microsoft.com/office/drawing/2014/chartex" xmlns:cx1="http://schemas.microsoft.com/office/drawing/2015/9/8/chartex" xmlns:cx2="http://schemas.microsoft.com/office/drawing/2015/10/21/chartex" xmlns:cx3="http://schemas.microsoft.com/office/drawing/2016/5/9/chartex" xmlns:cx4="http://schemas.microsoft.com/office/drawing/2016/5/10/chartex" xmlns:cx5="http://schemas.microsoft.com/office/drawing/2016/5/11/chartex" xmlns:cx6="http://schemas.microsoft.com/office/drawing/2016/5/12/chartex" xmlns:cx7="http://schemas.microsoft.com/office/drawing/2016/5/13/chartex" xmlns:cx8="http://schemas.microsoft.com/office/drawing/2016/5/14/chartex" xmlns:mc="http://schemas.openxmlformats.org/markup-compatibility/2006" xmlns:aink="http://schemas.microsoft.com/office/drawing/2016/ink" xmlns:am3d="http://schemas.microsoft.com/office/drawing/2017/model3d" xmlns:o="urn:schemas-microsoft-com:office:office" xmlns:oel="http://schemas.microsoft.com/office/2019/extlst" xmlns:r="http://schemas.openxmlformats.org/officeDocument/2006/relationships" xmlns:m="http://schemas.openxmlformats.org/officeDocument/2006/math" xmlns:v="urn:schemas-microsoft-com:vml" xmlns:wp14="http://schemas.microsoft.com/office/word/2010/wordprocessingDrawing" xmlns:wp="http://schemas.openxmlformats.org/drawingml/2006/wordprocessingDrawing" xmlns:w10="urn:schemas-microsoft-com:office:word" xmlns:w="http://schemas.openxmlformats.org/wordprocessingml/2006/main" xmlns:w14="http://schemas.microsoft.com/office/word/2010/wordml" xmlns:w15="http://schemas.microsoft.com/office/word/2012/wordml" xmlns:w16cex="http://schemas.microsoft.com/office/word/2018/wordml/cex" xmlns:w16cid="http://schemas.microsoft.com/office/word/2016/wordml/cid" xmlns:w16="http://schemas.microsoft.com/office/word/2018/wordml" xmlns:w16du="http://schemas.microsoft.com/office/word/2023/wordml/word16du" xmlns:w16sdtdh="http://schemas.microsoft.com/office/word/2020/wordml/sdtdatahash" xmlns:w16sdtfl="http://schemas.microsoft.com/office/word/2024/wordml/sdtformatlock" xmlns:w16se="http://schemas.microsoft.com/office/word/2015/wordml/symex" xmlns:wpg="http://schemas.microsoft.com/office/word/2010/wordprocessingGroup" xmlns:wpi="http://schemas.microsoft.com/office/word/2010/wordprocessingInk" xmlns:wne="http://schemas.microsoft.com/office/word/2006/wordml" xmlns:wps="http://schemas.microsoft.com/office/word/2010/wordprocessingShape" mc:Ignorable="w14 w15 w16se w16cid w16 w16cex w16sdtdh w16sdtfl w16du wp14">
   <w:abstractNum w:abstractNumId="0" w15:restartNumberingAfterBreak="0">
     <w:nsid w:val="2FB4421D"/>
     <w:multiLevelType w:val="multilevel"/>
@@ -2555,7 +2512,7 @@
 </file>
 
 <file path=word/styles.xml><?xml version="1.0" encoding="utf-8"?>
-<w:styles xmlns:mc="http://schemas.openxmlformats.org/markup-compatibility/2006" xmlns:r="http://schemas.openxmlformats.org/officeDocument/2006/relationships" xmlns:w="http://schemas.openxmlformats.org/wordprocessingml/2006/main" xmlns:w14="http://schemas.microsoft.com/office/word/2010/wordml" xmlns:w15="http://schemas.microsoft.com/office/word/2012/wordml" xmlns:w16cex="http://schemas.microsoft.com/office/word/2018/wordml/cex" xmlns:w16cid="http://schemas.microsoft.com/office/word/2016/wordml/cid" xmlns:w16="http://schemas.microsoft.com/office/word/2018/wordml" xmlns:w16du="http://schemas.microsoft.com/office/word/2023/wordml/word16du" xmlns:w16sdtdh="http://schemas.microsoft.com/office/word/2020/wordml/sdtdatahash" xmlns:w16se="http://schemas.microsoft.com/office/word/2015/wordml/symex" mc:Ignorable="w14 w15 w16se w16cid w16 w16cex w16sdtdh w16du">
+<w:styles xmlns:mc="http://schemas.openxmlformats.org/markup-compatibility/2006" xmlns:r="http://schemas.openxmlformats.org/officeDocument/2006/relationships" xmlns:w="http://schemas.openxmlformats.org/wordprocessingml/2006/main" xmlns:w14="http://schemas.microsoft.com/office/word/2010/wordml" xmlns:w15="http://schemas.microsoft.com/office/word/2012/wordml" xmlns:w16cex="http://schemas.microsoft.com/office/word/2018/wordml/cex" xmlns:w16cid="http://schemas.microsoft.com/office/word/2016/wordml/cid" xmlns:w16="http://schemas.microsoft.com/office/word/2018/wordml" xmlns:w16du="http://schemas.microsoft.com/office/word/2023/wordml/word16du" xmlns:w16sdtdh="http://schemas.microsoft.com/office/word/2020/wordml/sdtdatahash" xmlns:w16sdtfl="http://schemas.microsoft.com/office/word/2024/wordml/sdtformatlock" xmlns:w16se="http://schemas.microsoft.com/office/word/2015/wordml/symex" mc:Ignorable="w14 w15 w16se w16cid w16 w16cex w16sdtdh w16sdtfl w16du">
   <w:docDefaults>
     <w:rPrDefault>
       <w:rPr>
@@ -3155,6 +3112,7 @@
   <w:style w:type="character" w:default="1" w:styleId="Fuentedeprrafopredeter">
     <w:name w:val="Default Paragraph Font"/>
     <w:uiPriority w:val="1"/>
+    <w:semiHidden/>
     <w:unhideWhenUsed/>
   </w:style>
   <w:style w:type="table" w:default="1" w:styleId="Tablanormal">

</xml_diff>